<commit_message>
Lucas's six decks: learning journey and plain language
- Every "ask" box is now a question for the room; maxims removed.
- Predictions added before the p-value shuffle, the 100-studies button,
  the three RDD checks, the live estimates in the QA clinic and the
  two-year ratio.
- Oct14 S1: the horizon conclusion was repeated on six slides; dropped
  "The measured part and the assumed part" and merged question 3 into
  the stress-test exercise.
- Oct14 S3: the question-sorting exercise now comes before the rule it
  teaches.
- Oct15 S2: the opening vote moved to after the scheme is introduced; a
  "Write the brief" slide gives pairs twelve minutes of drafting time;
  finding 3's title no longer asserts the pass-through the deck says is
  unsupported (findings pack regenerated).
- Oct13 S2: DiD was this morning, not yesterday.
- Staged or aphoristic lines rewritten; author rationale taken out of
  the speaker notes.

Co-Authored-By: Claude Opus 5.5 <noreply@anthropic.com>
</commit_message>
<xml_diff>
--- a/Module_2_Oct_2026_v2/Oct15_session2_findings.docx
+++ b/Module_2_Oct_2026_v2/Oct15_session2_findings.docx
@@ -208,13 +208,13 @@
       </w:r>
     </w:p>
     <w:bookmarkEnd w:id="21"/>
-    <w:bookmarkStart w:id="22" w:name="X14529eb0aaaea4d43527dbf76d5d87bae014a11"/>
+    <w:bookmarkStart w:id="22" w:name="Xa8ae2ea204b356774c2b51531fba7ef89200957"/>
     <w:p>
       <w:pPr>
         <w:pStyle w:val="Heading2"/>
       </w:pPr>
       <w:r>
-        <w:t xml:space="preserve">Finding 3. Operators passed some of the saving to customers</w:t>
+        <w:t xml:space="preserve">Finding 3. Freight rates fell slightly more for participating operators</w:t>
       </w:r>
     </w:p>
     <w:p>
@@ -348,7 +348,7 @@
         <w:t xml:space="preserve"> </w:t>
       </w:r>
       <w:r>
-        <w:t xml:space="preserve">An honest null result with wide intervals. Absence of evidence, and the evaluation says so.</w:t>
+        <w:t xml:space="preserve">A null result with wide intervals. Absence of evidence, and the evaluation says so.</w:t>
       </w:r>
     </w:p>
     <w:p>
@@ -468,7 +468,7 @@
         <w:t xml:space="preserve"> </w:t>
       </w:r>
       <w:r>
-        <w:t xml:space="preserve">(Operators passed some of the saving to customers) does not license:</w:t>
+        <w:t xml:space="preserve">(Freight rates fell slightly more for participating operators) does not license:</w:t>
       </w:r>
       <w:r>
         <w:t xml:space="preserve"> </w:t>

</xml_diff>